<commit_message>
Mise à jour du rapport : section Git complétée
</commit_message>
<xml_diff>
--- a/livrables/Rapport_Prix_Immobilier.docx
+++ b/livrables/Rapport_Prix_Immobilier.docx
@@ -2918,7 +2918,7 @@
         <w:t xml:space="preserve"> </w:t>
       </w:r>
       <w:r>
-        <w:t xml:space="preserve">(ajout du README) et</w:t>
+        <w:t xml:space="preserve">(ajout du README),</w:t>
       </w:r>
       <w:r>
         <w:t xml:space="preserve"> </w:t>
@@ -2933,7 +2933,22 @@
         <w:t xml:space="preserve"> </w:t>
       </w:r>
       <w:r>
-        <w:t xml:space="preserve">(ajout du rapport et de la présentation), chacune créée pour une fonctionnalité précise.</w:t>
+        <w:t xml:space="preserve">(ajout du rapport et de la présentation) et</w:t>
+      </w:r>
+      <w:r>
+        <w:t xml:space="preserve"> </w:t>
+      </w:r>
+      <w:r>
+        <w:rPr>
+          <w:rStyle w:val="VerbatimChar"/>
+        </w:rPr>
+        <w:t xml:space="preserve">feature/notebook-complet</w:t>
+      </w:r>
+      <w:r>
+        <w:t xml:space="preserve"> </w:t>
+      </w:r>
+      <w:r>
+        <w:t xml:space="preserve">(mise à jour du notebook avec tous les compléments), chacune créée pour une fonctionnalité précise.</w:t>
       </w:r>
     </w:p>
     <w:p>
@@ -2970,7 +2985,7 @@
         <w:t xml:space="preserve"> </w:t>
       </w:r>
       <w:r>
-        <w:t xml:space="preserve">par une pull request (n° 1 pour le README, n° 2 pour les livrables).</w:t>
+        <w:t xml:space="preserve">par une pull request (n° 1 pour le README, n° 2 pour les livrables, n° 3 pour le notebook complet).</w:t>
       </w:r>
     </w:p>
     <w:p>
@@ -3008,13 +3023,13 @@
           <w:bCs/>
           <w:b/>
         </w:rPr>
-        <w:t xml:space="preserve">Version</w:t>
-      </w:r>
-      <w:r>
-        <w:t xml:space="preserve"> </w:t>
-      </w:r>
-      <w:r>
-        <w:t xml:space="preserve">: la version finale est étiquetée</w:t>
+        <w:t xml:space="preserve">Versions</w:t>
+      </w:r>
+      <w:r>
+        <w:t xml:space="preserve"> </w:t>
+      </w:r>
+      <w:r>
+        <w:t xml:space="preserve">:</w:t>
       </w:r>
       <w:r>
         <w:t xml:space="preserve"> </w:t>
@@ -3026,7 +3041,25 @@
         <w:t xml:space="preserve">v1.0</w:t>
       </w:r>
       <w:r>
-        <w:t xml:space="preserve">.</w:t>
+        <w:t xml:space="preserve"> </w:t>
+      </w:r>
+      <w:r>
+        <w:t xml:space="preserve">(README, rapport et présentation) puis</w:t>
+      </w:r>
+      <w:r>
+        <w:t xml:space="preserve"> </w:t>
+      </w:r>
+      <w:r>
+        <w:rPr>
+          <w:rStyle w:val="VerbatimChar"/>
+        </w:rPr>
+        <w:t xml:space="preserve">v1.1</w:t>
+      </w:r>
+      <w:r>
+        <w:t xml:space="preserve"> </w:t>
+      </w:r>
+      <w:r>
+        <w:t xml:space="preserve">(notebook complet, version finale).</w:t>
       </w:r>
     </w:p>
     <w:p>
@@ -3048,7 +3081,7 @@
         <w:t xml:space="preserve"> </w:t>
       </w:r>
       <w:r>
-        <w:t xml:space="preserve">: le nettoyage et la modélisation ont été réalisés dans le notebook avant la création du dépôt. L’historique Git montre donc les étapes de publication (notebook, README, livrables) et non chaque étape d’analyse. Les pull requests ont été fusionnées par l’auteur, sans relecture par un tiers.</w:t>
+        <w:t xml:space="preserve">: le nettoyage et la modélisation ont été réalisés dans le notebook avant la création du dépôt. L’historique Git montre donc les étapes de publication (notebook, README, livrables, mise à jour du notebook) et non chaque étape d’analyse. Les pull requests ont été fusionnées par l’auteur, sans relecture par un tiers.</w:t>
       </w:r>
     </w:p>
     <w:bookmarkEnd w:id="41"/>

</xml_diff>